<commit_message>
Rewrite short contract to mirror the source template as closely as possible
Co-Authored-By: Claude Opus 5.5 <noreply@anthropic.com>
Claude-Session: https://claude.ai/code/session_018ZBy6xfQB1sHcr5htdU16V
</commit_message>
<xml_diff>
--- a/Договор_циклёвка_короткий.docx
+++ b/Договор_циклёвка_короткий.docx
@@ -4,37 +4,37 @@
   <w:body>
     <w:p>
       <w:pPr>
-        <w:spacing w:before="0" w:after="0"/>
+        <w:spacing w:before="0"/>
         <w:jc w:val="center"/>
       </w:pPr>
       <w:r>
         <w:rPr>
           <w:b/>
         </w:rPr>
-        <w:t>ДОГОВОР НА ВЫПОЛНЕНИЕ РАБОТ ПО ЦИКЛЁВКЕ ПАРКЕТА № ____</w:t>
+        <w:t>ДОГОВОР ОКАЗАНИЯ УСЛУГ</w:t>
       </w:r>
     </w:p>
     <w:p>
       <w:pPr>
-        <w:spacing w:before="80" w:after="0"/>
+        <w:spacing w:before="80"/>
         <w:jc w:val="right"/>
       </w:pPr>
       <w:r>
-        <w:t>г. ______________</w:t>
+        <w:t>г. Москва</w:t>
       </w:r>
     </w:p>
     <w:p>
       <w:pPr>
-        <w:spacing w:before="0" w:after="120"/>
+        <w:spacing w:before="0"/>
         <w:jc w:val="right"/>
       </w:pPr>
       <w:r>
-        <w:t>«____» ____________ 20___ г.</w:t>
+        <w:t>«____» ____________ _______ г.</w:t>
       </w:r>
     </w:p>
     <w:p>
       <w:pPr>
-        <w:spacing w:before="0" w:after="0"/>
+        <w:spacing w:before="160"/>
       </w:pPr>
       <w:r>
         <w:rPr>
@@ -43,12 +43,28 @@
         <w:t xml:space="preserve">Исполнитель: </w:t>
       </w:r>
       <w:r>
-        <w:t>Индивидуальный предприниматель Тимшин Иван Николаевич, ОГРНИП: 324430000009083, ИНН: 433401898838, в лице представителя Тимшина Льва Николаевича, действующего по доверенности № ______ от «____» ____________ 20___ г., телефон: ____________________,</w:t>
+        <w:t>Индивидуальный предприниматель Тимшин Иван Николаевич,</w:t>
       </w:r>
     </w:p>
     <w:p>
       <w:pPr>
-        <w:spacing w:before="0" w:after="0"/>
+        <w:spacing w:before="0"/>
+      </w:pPr>
+      <w:r>
+        <w:t>ОГРНИП: 324430000009083, ИНН: 433401898838, телефон: ____________________,</w:t>
+      </w:r>
+    </w:p>
+    <w:p>
+      <w:pPr>
+        <w:spacing w:before="0"/>
+      </w:pPr>
+      <w:r>
+        <w:t>в лице представителя Тимшина Льва Николаевича по доверенности № ______ от ____________,</w:t>
+      </w:r>
+    </w:p>
+    <w:p>
+      <w:pPr>
+        <w:spacing w:before="0"/>
       </w:pPr>
       <w:r>
         <w:t>банковские реквизиты:</w:t>
@@ -56,15 +72,15 @@
     </w:p>
     <w:p>
       <w:pPr>
-        <w:spacing w:before="0" w:after="0"/>
+        <w:spacing w:before="0"/>
       </w:pPr>
       <w:r>
-        <w:t>Счёт: ______________________________ Банк: ________________________ БИК: ______________</w:t>
+        <w:t>Счёт: ______________________________ Банк: ______________________ БИК: ____________</w:t>
       </w:r>
     </w:p>
     <w:p>
       <w:pPr>
-        <w:spacing w:before="0" w:after="0"/>
+        <w:spacing w:before="0"/>
       </w:pPr>
       <w:r>
         <w:t>Корр. счёт: ______________________________</w:t>
@@ -72,7 +88,7 @@
     </w:p>
     <w:p>
       <w:pPr>
-        <w:spacing w:before="0" w:after="0"/>
+        <w:spacing w:before="0"/>
       </w:pPr>
       <w:r>
         <w:rPr>
@@ -81,12 +97,12 @@
         <w:t xml:space="preserve">Заказчик: </w:t>
       </w:r>
       <w:r>
-        <w:t>ФИО полностью ________________________________________________________________,</w:t>
+        <w:t>ФИО полностью ____________________________________________________,</w:t>
       </w:r>
     </w:p>
     <w:p>
       <w:pPr>
-        <w:spacing w:before="0" w:after="0"/>
+        <w:spacing w:before="0"/>
       </w:pPr>
       <w:r>
         <w:t>паспорт: серия __________ № ________________,</w:t>
@@ -94,23 +110,23 @@
     </w:p>
     <w:p>
       <w:pPr>
-        <w:spacing w:before="0" w:after="0"/>
+        <w:spacing w:before="0"/>
       </w:pPr>
       <w:r>
-        <w:t>зарегистрирован по адресу: ______________________________________________________,</w:t>
+        <w:t>зарегистрирован по адресу: _______________________________________________________,</w:t>
       </w:r>
     </w:p>
     <w:p>
       <w:pPr>
-        <w:spacing w:before="0" w:after="0"/>
+        <w:spacing w:before="0"/>
       </w:pPr>
       <w:r>
-        <w:t>телефон: ________________________.</w:t>
+        <w:t>телефон: ______________________________.</w:t>
       </w:r>
     </w:p>
     <w:p>
       <w:pPr>
-        <w:spacing w:before="140" w:after="0"/>
+        <w:spacing w:before="120"/>
       </w:pPr>
       <w:r/>
       <w:r>
@@ -122,15 +138,15 @@
     </w:p>
     <w:p>
       <w:pPr>
-        <w:spacing w:before="0" w:after="0"/>
+        <w:spacing w:before="0"/>
       </w:pPr>
       <w:r>
-        <w:t>1.1. Исполнитель обязуется по заданию Заказчика выполнить работы по циклёвке (шлифовке) и покрытию паркета в квартире по адресу: ____________________________________________, площадью ________ м², а Заказчик обязуется принять и оплатить эти работы.</w:t>
+        <w:t>1.1. Исполнитель обязуется по заданию Заказчика оказать услуги по циклёвке паркета в квартире, расположенной по адресу: ____________________________________________________________, а Заказчик обязуется принять и оплатить эти услуги.</w:t>
       </w:r>
     </w:p>
     <w:p>
       <w:pPr>
-        <w:spacing w:before="0" w:after="0"/>
+        <w:spacing w:before="0"/>
       </w:pPr>
       <w:r>
         <w:t>1.2. Перечень работ:</w:t>
@@ -138,55 +154,55 @@
     </w:p>
     <w:p>
       <w:pPr>
-        <w:spacing w:before="0" w:after="0"/>
+        <w:spacing w:before="0"/>
       </w:pPr>
       <w:r>
-        <w:t xml:space="preserve">      [ ] циклёвка (шлифовка) в ____ прохода     [ ] шлифовка углов и у стен     [ ] шпатлёвка щелей</w:t>
+        <w:t>____________________________________________________________________________________</w:t>
       </w:r>
     </w:p>
     <w:p>
       <w:pPr>
-        <w:spacing w:before="0" w:after="0"/>
+        <w:spacing w:before="0"/>
       </w:pPr>
       <w:r>
-        <w:t xml:space="preserve">      [ ] грунтование     [ ] лак / масло: марка ______________________, ____ слоя, блеск ____________</w:t>
+        <w:t>____________________________________________________________________________________</w:t>
       </w:r>
     </w:p>
     <w:p>
       <w:pPr>
-        <w:spacing w:before="0" w:after="0"/>
+        <w:spacing w:before="0"/>
       </w:pPr>
       <w:r>
-        <w:t xml:space="preserve">      [ ] демонтаж / монтаж плинтуса     [ ] вынос / расстановка мебели</w:t>
+        <w:t>____________________________________________________________________________________</w:t>
       </w:r>
     </w:p>
     <w:p>
       <w:pPr>
-        <w:spacing w:before="0" w:after="0"/>
+        <w:spacing w:before="0"/>
       </w:pPr>
       <w:r>
-        <w:t xml:space="preserve">      [ ] другое: ___________________________________________________________________</w:t>
+        <w:t>____________________________________________________________________________________</w:t>
       </w:r>
     </w:p>
     <w:p>
       <w:pPr>
-        <w:spacing w:before="0" w:after="0"/>
+        <w:spacing w:before="0"/>
       </w:pPr>
       <w:r>
-        <w:t>1.3. Материалы предоставляет: [ ] Заказчик / [ ] Исполнитель. За качество материалов Заказчика Исполнитель не отвечает (ст. 713 ГК РФ).</w:t>
+        <w:t>____________________________________________________________________________________</w:t>
       </w:r>
     </w:p>
     <w:p>
       <w:pPr>
-        <w:spacing w:before="0" w:after="0"/>
+        <w:spacing w:before="0"/>
       </w:pPr>
       <w:r>
-        <w:t>1.4. Состояние паркета до начала работ (щели, сколы, пятна, толщина слоя) фиксируется фото, отправленными Заказчику в мессенджере. Эти дефекты не являются недостатками работ.</w:t>
+        <w:t>1.3. Материалы предоставляет: [ ] Заказчик / [ ] Исполнитель.</w:t>
       </w:r>
     </w:p>
     <w:p>
       <w:pPr>
-        <w:spacing w:before="140" w:after="0"/>
+        <w:spacing w:before="120"/>
       </w:pPr>
       <w:r/>
       <w:r>
@@ -198,31 +214,23 @@
     </w:p>
     <w:p>
       <w:pPr>
-        <w:spacing w:before="0" w:after="0"/>
+        <w:spacing w:before="0"/>
       </w:pPr>
       <w:r>
-        <w:t>2.1. Начало работ: «____» ____________ 20___ г.</w:t>
+        <w:t>2.1. Начало работ: «______________________».</w:t>
       </w:r>
     </w:p>
     <w:p>
       <w:pPr>
-        <w:spacing w:before="0" w:after="0"/>
+        <w:spacing w:before="0"/>
       </w:pPr>
       <w:r>
-        <w:t>2.2. Окончание работ: «____» ____________ 20___ г.</w:t>
+        <w:t>2.2. Окончание работ: «______________________».</w:t>
       </w:r>
     </w:p>
     <w:p>
       <w:pPr>
-        <w:spacing w:before="0" w:after="0"/>
-      </w:pPr>
-      <w:r>
-        <w:t>2.3. Сроки сдвигаются на время задержки оплаты, отсутствия доступа, неготовности помещения, а также при выявлении скрытых дефектов пола до согласования доп. работ (ст. 716, 719 ГК РФ).</w:t>
-      </w:r>
-    </w:p>
-    <w:p>
-      <w:pPr>
-        <w:spacing w:before="140" w:after="0"/>
+        <w:spacing w:before="120"/>
       </w:pPr>
       <w:r/>
       <w:r>
@@ -234,15 +242,23 @@
     </w:p>
     <w:p>
       <w:pPr>
-        <w:spacing w:before="0" w:after="0"/>
+        <w:spacing w:before="0"/>
       </w:pPr>
       <w:r>
-        <w:t>3.1. Стоимость работ фиксированная и составляет ______________________ рублей. НДС не облагается.</w:t>
+        <w:t>3.1. Общая стоимость услуг составляет ____________________________ рублей.</w:t>
       </w:r>
     </w:p>
     <w:p>
       <w:pPr>
-        <w:spacing w:before="0" w:after="0"/>
+        <w:spacing w:before="0"/>
+      </w:pPr>
+      <w:r>
+        <w:t>НДС не облагается.</w:t>
+      </w:r>
+    </w:p>
+    <w:p>
+      <w:pPr>
+        <w:spacing w:before="0"/>
       </w:pPr>
       <w:r>
         <w:t>3.2. Оплата производится:</w:t>
@@ -250,39 +266,23 @@
     </w:p>
     <w:p>
       <w:pPr>
-        <w:spacing w:before="0" w:after="0"/>
+        <w:spacing w:before="0"/>
       </w:pPr>
       <w:r>
-        <w:t xml:space="preserve">      50% — ______________ руб. — в день начала работ, до их начала;</w:t>
+        <w:t>50% аванс при начале работ, 50% — после подписания акта выполненных работ.</w:t>
       </w:r>
     </w:p>
     <w:p>
       <w:pPr>
-        <w:spacing w:before="0" w:after="0"/>
+        <w:spacing w:before="0"/>
       </w:pPr>
       <w:r>
-        <w:t xml:space="preserve">      50% — ______________ руб. — после подписания акта выполненных работ.</w:t>
+        <w:t>3.3. На внесённые денежные средства выдаётся товарный чек.</w:t>
       </w:r>
     </w:p>
     <w:p>
       <w:pPr>
-        <w:spacing w:before="0" w:after="0"/>
-      </w:pPr>
-      <w:r>
-        <w:t>3.3. На каждую внесённую сумму Исполнитель выдаёт Заказчику товарный чек.</w:t>
-      </w:r>
-    </w:p>
-    <w:p>
-      <w:pPr>
-        <w:spacing w:before="0" w:after="0"/>
-      </w:pPr>
-      <w:r>
-        <w:t>3.4. Дополнительные работы выполняются и оплачиваются только по согласованию сторон.</w:t>
-      </w:r>
-    </w:p>
-    <w:p>
-      <w:pPr>
-        <w:spacing w:before="140" w:after="0"/>
+        <w:spacing w:before="120"/>
       </w:pPr>
       <w:r/>
       <w:r>
@@ -294,23 +294,23 @@
     </w:p>
     <w:p>
       <w:pPr>
-        <w:spacing w:before="0" w:after="0"/>
+        <w:spacing w:before="0"/>
       </w:pPr>
       <w:r>
-        <w:t>4.1. Исполнитель обязуется выполнить работы качественно, в срок и по технологии производителя материалов.</w:t>
+        <w:t>4.1. Исполнитель обязуется выполнить работы качественно и в срок.</w:t>
       </w:r>
     </w:p>
     <w:p>
       <w:pPr>
-        <w:spacing w:before="0" w:after="0"/>
+        <w:spacing w:before="0"/>
       </w:pPr>
       <w:r>
-        <w:t>4.2. Заказчик обязуется освободить помещение от мебели, обеспечить доступ, электричество 220 В, температуру +18…+25 °C и влажность 40–60%, не ходить по покрытию до срока, указанного Исполнителем, и принять работы по акту.</w:t>
+        <w:t>4.2. Заказчик обязуется обеспечить доступ в квартиру и принять работы по акту.</w:t>
       </w:r>
     </w:p>
     <w:p>
       <w:pPr>
-        <w:spacing w:before="0" w:after="0"/>
+        <w:spacing w:before="0"/>
       </w:pPr>
       <w:r>
         <w:t>4.3. Исполнитель вправе привлекать третьих лиц для выполнения работ.</w:t>
@@ -318,162 +318,78 @@
     </w:p>
     <w:p>
       <w:pPr>
-        <w:spacing w:before="0" w:after="0"/>
-      </w:pPr>
-      <w:r>
-        <w:t>4.4. Если Исполнитель письменно (в том числе в мессенджере) предупредил Заказчика о риске для результата (ветхий паркет, тонкий слой, дефекты основания, материалы Заказчика), а Заказчик настоял на работах, Исполнитель за последствия не отвечает (п. 3 ст. 716 ГК РФ).</w:t>
-      </w:r>
-    </w:p>
-    <w:p>
-      <w:pPr>
-        <w:spacing w:before="140" w:after="0"/>
+        <w:spacing w:before="120"/>
       </w:pPr>
       <w:r/>
       <w:r>
         <w:rPr>
           <w:b/>
         </w:rPr>
-        <w:t>5. ПРИЁМКА И ГАРАНТИЯ</w:t>
+        <w:t>5. ОТВЕТСТВЕННОСТЬ СТОРОН</w:t>
       </w:r>
     </w:p>
     <w:p>
       <w:pPr>
-        <w:spacing w:before="0" w:after="0"/>
+        <w:spacing w:before="0"/>
       </w:pPr>
       <w:r>
-        <w:t>5.1. Заказчик принимает работы в течение 2 дней после уведомления. Если в этот срок он письменно не заявил конкретные недостатки, работы считаются принятыми.</w:t>
+        <w:t>5.1. За просрочку Исполнитель уплачивает пеню 0.1% от суммы за каждый день просрочки.</w:t>
       </w:r>
     </w:p>
     <w:p>
       <w:pPr>
-        <w:spacing w:before="0" w:after="0"/>
+        <w:spacing w:before="0"/>
       </w:pPr>
       <w:r>
-        <w:t>5.2. Качество оценивается при осмотре стоя, при обычном освещении помещения.</w:t>
+        <w:t>5.2. Недостатки, обнаруженные при приёмке, устраняются Исполнителем безвозмездно в разумный срок.</w:t>
       </w:r>
     </w:p>
     <w:p>
       <w:pPr>
-        <w:spacing w:before="0" w:after="0"/>
+        <w:spacing w:before="0"/>
       </w:pPr>
       <w:r>
-        <w:t>5.3. Гарантия на работы — 12 месяцев с даты подписания акта: на отслоение и шелушение покрытия и дефекты шлифовки, возникшие по вине Исполнителя.</w:t>
+        <w:t>5.3. Гарантия на выполненные работы — 1 год с даты подписания акта. Гарантия не распространяется на механические повреждения, износ, воздействие воды и нарушение температуры и влажности в помещении.</w:t>
       </w:r>
     </w:p>
     <w:p>
       <w:pPr>
-        <w:spacing w:before="0" w:after="0"/>
-      </w:pPr>
-      <w:r>
-        <w:t>5.4. Гарантия не распространяется на: механические повреждения и износ; воздействие воды; нарушение температуры и влажности (щели, коробление, трещины); выгорание на солнце; дефекты самого паркета и основания (скрип, отслоение планок); естественные свойства древесины (разнотон, сучки, старые пятна, проявившиеся после шлифовки); вмешательство третьих лиц.</w:t>
-      </w:r>
-    </w:p>
-    <w:p>
-      <w:pPr>
-        <w:spacing w:before="140" w:after="0"/>
+        <w:spacing w:before="120"/>
       </w:pPr>
       <w:r/>
       <w:r>
         <w:rPr>
           <w:b/>
         </w:rPr>
-        <w:t>6. ОТВЕТСТВЕННОСТЬ СТОРОН</w:t>
+        <w:t>6. ЗАКЛЮЧИТЕЛЬНЫЕ ПОЛОЖЕНИЯ</w:t>
       </w:r>
     </w:p>
     <w:p>
       <w:pPr>
-        <w:spacing w:before="0" w:after="0"/>
+        <w:spacing w:before="0"/>
       </w:pPr>
       <w:r>
-        <w:t>6.1. Стороны несут ответственность в соответствии с законодательством РФ.</w:t>
+        <w:t>6.1. Договор вступает в силу с момента подписания и действует до полного исполнения обязательств.</w:t>
       </w:r>
     </w:p>
     <w:p>
       <w:pPr>
-        <w:spacing w:before="0" w:after="0"/>
+        <w:spacing w:before="0"/>
       </w:pPr>
       <w:r>
-        <w:t>6.2. Недостатки, обнаруженные при приёмке или в гарантийный срок по вине Исполнителя, устраняются Исполнителем безвозмездно в разумный срок.</w:t>
+        <w:t>6.2. Споры решаются путём переговоров, при неурегулировании — в суде в соответствии с законом.</w:t>
       </w:r>
     </w:p>
     <w:p>
       <w:pPr>
-        <w:spacing w:before="0" w:after="0"/>
-      </w:pPr>
-      <w:r>
-        <w:t>6.3. Исполнитель не отвечает за вещи и технику, оставленные Заказчиком в рабочей зоне без укрытия.</w:t>
-      </w:r>
-    </w:p>
-    <w:p>
-      <w:pPr>
-        <w:spacing w:before="0" w:after="0"/>
-      </w:pPr>
-      <w:r>
-        <w:t>6.4. За просрочку оплаты Заказчик уплачивает пеню 0,5% от неоплаченной суммы за каждый день просрочки.</w:t>
-      </w:r>
-    </w:p>
-    <w:p>
-      <w:pPr>
-        <w:spacing w:before="140" w:after="0"/>
+        <w:spacing w:before="120"/>
       </w:pPr>
       <w:r/>
       <w:r>
         <w:rPr>
           <w:b/>
         </w:rPr>
-        <w:t>7. ЗАКЛЮЧИТЕЛЬНЫЕ ПОЛОЖЕНИЯ</w:t>
-      </w:r>
-    </w:p>
-    <w:p>
-      <w:pPr>
-        <w:spacing w:before="0" w:after="0"/>
-      </w:pPr>
-      <w:r>
-        <w:t>7.1. Договор вступает в силу с момента подписания и действует до полного исполнения обязательств, включая гарантийные.</w:t>
-      </w:r>
-    </w:p>
-    <w:p>
-      <w:pPr>
-        <w:spacing w:before="0" w:after="0"/>
-      </w:pPr>
-      <w:r>
-        <w:t>7.2. Договор и акт подписывает представитель Исполнителя по доверенности. Все права и обязанности по Договору, включая гарантийные, возникают у ИП Тимшина И.Н. (ст. 182 ГК РФ).</w:t>
-      </w:r>
-    </w:p>
-    <w:p>
-      <w:pPr>
-        <w:spacing w:before="0" w:after="0"/>
-      </w:pPr>
-      <w:r>
-        <w:t>7.3. Переписка в мессенджере по телефонам сторон признаётся письменной.</w:t>
-      </w:r>
-    </w:p>
-    <w:p>
-      <w:pPr>
-        <w:spacing w:before="0" w:after="0"/>
-      </w:pPr>
-      <w:r>
-        <w:t>7.4. Споры решаются путём переговоров, при неурегулировании — в суде в соответствии с законом.</w:t>
-      </w:r>
-    </w:p>
-    <w:p>
-      <w:pPr>
-        <w:spacing w:before="0" w:after="0"/>
-      </w:pPr>
-      <w:r>
-        <w:t>7.5. Договор составлен в двух экземплярах, по одному для каждой стороны.</w:t>
-      </w:r>
-    </w:p>
-    <w:p>
-      <w:pPr>
-        <w:spacing w:before="140" w:after="0"/>
-      </w:pPr>
-      <w:r/>
-      <w:r>
-        <w:rPr>
-          <w:b/>
-        </w:rPr>
-        <w:t>8. РЕКВИЗИТЫ И ПОДПИСИ СТОРОН</w:t>
+        <w:t>7. РЕКВИЗИТЫ И ПОДПИСИ СТОРОН</w:t>
       </w:r>
     </w:p>
     <w:tbl>
@@ -482,16 +398,15 @@
         <w:tblLook w:firstColumn="1" w:firstRow="1" w:lastColumn="0" w:lastRow="0" w:noHBand="0" w:noVBand="1" w:val="04A0"/>
       </w:tblPr>
       <w:tblGrid>
-        <w:gridCol w:w="4961"/>
-        <w:gridCol w:w="4961"/>
+        <w:gridCol w:w="4819"/>
+        <w:gridCol w:w="4819"/>
       </w:tblGrid>
       <w:tr>
         <w:tc>
           <w:tcPr>
-            <w:tcW w:type="dxa" w:w="4961"/>
+            <w:tcW w:type="dxa" w:w="4819"/>
           </w:tcPr>
           <w:p>
-            <w:r/>
             <w:r>
               <w:rPr>
                 <w:b/>
@@ -508,27 +423,22 @@
               <w:br/>
             </w:r>
             <w:r>
-              <w:t>в лице представителя по доверенности</w:t>
+              <w:t>_______________ / Тимшин Л.Н.</w:t>
               <w:br/>
             </w:r>
             <w:r>
-              <w:t>Тимшина Льва Николаевича</w:t>
-              <w:br/>
-            </w:r>
-            <w:r>
-              <w:br/>
-            </w:r>
-            <w:r>
-              <w:t>_____________________ / Тимшин Л.Н.</w:t>
+              <w:t>(по доверенности)</w:t>
             </w:r>
           </w:p>
         </w:tc>
         <w:tc>
           <w:tcPr>
-            <w:tcW w:type="dxa" w:w="4961"/>
+            <w:tcW w:type="dxa" w:w="4819"/>
           </w:tcPr>
           <w:p>
-            <w:r/>
+            <w:pPr>
+              <w:jc w:val="center"/>
+            </w:pPr>
             <w:r>
               <w:rPr>
                 <w:b/>
@@ -537,22 +447,11 @@
               <w:br/>
             </w:r>
             <w:r>
+              <w:t>____________________</w:t>
               <w:br/>
             </w:r>
             <w:r>
-              <w:br/>
-            </w:r>
-            <w:r>
-              <w:br/>
-            </w:r>
-            <w:r>
-              <w:br/>
-            </w:r>
-            <w:r>
-              <w:br/>
-            </w:r>
-            <w:r>
-              <w:t>_____________________ / ________________</w:t>
+              <w:t>____________________</w:t>
             </w:r>
           </w:p>
         </w:tc>
@@ -560,7 +459,7 @@
     </w:tbl>
     <w:sectPr>
       <w:pgSz w:w="11906" w:h="16838"/>
-      <w:pgMar w:top="850" w:right="850" w:bottom="850" w:left="1134" w:header="720" w:footer="720" w:gutter="0"/>
+      <w:pgMar w:top="680" w:right="850" w:bottom="567" w:left="1417" w:header="720" w:footer="720" w:gutter="0"/>
       <w:cols w:space="720"/>
       <w:docGrid w:linePitch="360"/>
     </w:sectPr>
@@ -932,11 +831,11 @@
     <w:qFormat/>
     <w:rsid w:val="00FC693F"/>
     <w:pPr>
-      <w:spacing w:after="0" w:line="252" w:lineRule="auto"/>
+      <w:spacing w:after="0" w:line="240" w:lineRule="auto"/>
     </w:pPr>
     <w:rPr>
       <w:rFonts w:ascii="Times New Roman" w:hAnsi="Times New Roman" w:eastAsia="Times New Roman"/>
-      <w:sz w:val="22"/>
+      <w:sz w:val="21"/>
     </w:rPr>
   </w:style>
   <w:style w:type="paragraph" w:styleId="Header">

</xml_diff>

<commit_message>
Add contractor bank details to both contracts
Co-Authored-By: Claude Opus 5.5 <noreply@anthropic.com>
Claude-Session: https://claude.ai/code/session_018ZBy6xfQB1sHcr5htdU16V
</commit_message>
<xml_diff>
--- a/Договор_циклёвка_короткий.docx
+++ b/Договор_циклёвка_короткий.docx
@@ -75,7 +75,7 @@
         <w:spacing w:before="0"/>
       </w:pPr>
       <w:r>
-        <w:t>Счёт: ______________________________ Банк: ______________________ БИК: ____________</w:t>
+        <w:t>Расчётный счёт: 40802810820000238508, Банк: ООО «Банк Точка», БИК: 044525104</w:t>
       </w:r>
     </w:p>
     <w:p>
@@ -83,7 +83,7 @@
         <w:spacing w:before="0"/>
       </w:pPr>
       <w:r>
-        <w:t>Корр. счёт: ______________________________</w:t>
+        <w:t>Корр. счёт: 30101810745374525104</w:t>
       </w:r>
     </w:p>
     <w:p>

</xml_diff>